<commit_message>
Fix italic formatting in report
Co-Authored-By: Claude Opus 5.5 <noreply@anthropic.com>
</commit_message>
<xml_diff>
--- a/RAG_Report.docx
+++ b/RAG_Report.docx
@@ -2144,7 +2144,43 @@
           <w:sz w:val="24"/>
           <w:szCs w:val="24"/>
         </w:rPr>
-        <w:t xml:space="preserve"> Pipeline 1 retrieved Art. 17(1), the general rule listing grounds *for* erasure. Answer 1 then returned those grounds (data no longer necessary, consent withdrawn) as the cases where erasure does *not* apply, which is the opposite of the law. Answer 2 correctly listed the Art. 17(3) exceptions: freedom of expression, legal obligation or public task, public health, and archiving.</w:t>
+        <w:t xml:space="preserve"> Pipeline 1 retrieved Art. 17(1), the general rule listing grounds </w:t>
+      </w:r>
+      <w:r>
+        <w:rPr>
+          <w:rFonts w:ascii="Times New Roman" w:cs="Times New Roman" w:eastAsia="Times New Roman" w:hAnsi="Times New Roman"/>
+          <w:i/>
+          <w:iCs/>
+          <w:sz w:val="24"/>
+          <w:szCs w:val="24"/>
+        </w:rPr>
+        <w:t xml:space="preserve">for</w:t>
+      </w:r>
+      <w:r>
+        <w:rPr>
+          <w:rFonts w:ascii="Times New Roman" w:cs="Times New Roman" w:eastAsia="Times New Roman" w:hAnsi="Times New Roman"/>
+          <w:sz w:val="24"/>
+          <w:szCs w:val="24"/>
+        </w:rPr>
+        <w:t xml:space="preserve"> erasure. Answer 1 then returned those grounds (data no longer necessary, consent withdrawn) as the cases where erasure does </w:t>
+      </w:r>
+      <w:r>
+        <w:rPr>
+          <w:rFonts w:ascii="Times New Roman" w:cs="Times New Roman" w:eastAsia="Times New Roman" w:hAnsi="Times New Roman"/>
+          <w:i/>
+          <w:iCs/>
+          <w:sz w:val="24"/>
+          <w:szCs w:val="24"/>
+        </w:rPr>
+        <w:t xml:space="preserve">not</w:t>
+      </w:r>
+      <w:r>
+        <w:rPr>
+          <w:rFonts w:ascii="Times New Roman" w:cs="Times New Roman" w:eastAsia="Times New Roman" w:hAnsi="Times New Roman"/>
+          <w:sz w:val="24"/>
+          <w:szCs w:val="24"/>
+        </w:rPr>
+        <w:t xml:space="preserve"> apply, which is the opposite of the law. Answer 2 correctly listed the Art. 17(3) exceptions: freedom of expression, legal obligation or public task, public health, and archiving.</w:t>
       </w:r>
     </w:p>
     <w:p>

</xml_diff>